<commit_message>
docs: finalize report links and add presentation slides artifact
</commit_message>
<xml_diff>
--- a/docs/technical_report_final.docx
+++ b/docs/technical_report_final.docx
@@ -26,7 +26,7 @@
         <w:pStyle w:val="FirstParagraph"/>
         <w:rPr>
           <w:rFonts w:ascii="Arial" w:hAnsi="Arial" w:cs="Arial"/>
-          <w:color w:val="000000" w:themeColor="text1"/>
+          <w:color w:val="333333"/>
           <w:lang w:eastAsia="zh-CN"/>
         </w:rPr>
       </w:pPr>
@@ -76,99 +76,128 @@
         </w:rPr>
         <w:br/>
       </w:r>
-      <w:r>
-        <w:rPr>
+      <w:bookmarkStart w:id="1" w:name="X1c555f901308e0ca1fe83531c356e1a10b9c010"/>
+      <w:r>
+        <w:rPr>
+          <w:rStyle w:val="md-plain"/>
           <w:rFonts w:ascii="Arial" w:hAnsi="Arial" w:cs="Arial"/>
           <w:b/>
           <w:bCs/>
-          <w:color w:val="000000" w:themeColor="text1"/>
+          <w:color w:val="333333"/>
         </w:rPr>
         <w:t>Student Repository:</w:t>
       </w:r>
       <w:r>
         <w:rPr>
-          <w:rFonts w:ascii="Arial" w:hAnsi="Arial" w:cs="Arial"/>
-          <w:color w:val="000000" w:themeColor="text1"/>
+          <w:rStyle w:val="md-plain"/>
+          <w:rFonts w:ascii="Arial" w:hAnsi="Arial" w:cs="Arial"/>
+          <w:color w:val="333333"/>
         </w:rPr>
         <w:t xml:space="preserve"> </w:t>
       </w:r>
-      <w:hyperlink r:id="rId5">
+      <w:hyperlink r:id="rId5" w:history="1">
         <w:r>
           <w:rPr>
-            <w:rStyle w:val="af"/>
+            <w:rStyle w:val="md-plain"/>
             <w:rFonts w:ascii="Arial" w:hAnsi="Arial" w:cs="Arial"/>
-            <w:color w:val="000000" w:themeColor="text1"/>
+            <w:color w:val="4183C4"/>
+            <w:u w:val="single"/>
           </w:rPr>
           <w:t>https://github.com/Yuk11119/Web_Services_cw1</w:t>
         </w:r>
       </w:hyperlink>
       <w:r>
         <w:rPr>
-          <w:rFonts w:ascii="Arial" w:hAnsi="Arial" w:cs="Arial"/>
-          <w:color w:val="000000" w:themeColor="text1"/>
+          <w:rStyle w:val="md-linebreak"/>
+          <w:rFonts w:ascii="Arial" w:hAnsi="Arial" w:cs="Arial"/>
+          <w:color w:val="333333"/>
+        </w:rPr>
+        <w:t xml:space="preserve"> </w:t>
+      </w:r>
+      <w:r>
+        <w:rPr>
+          <w:rStyle w:val="md-linebreak"/>
+          <w:rFonts w:ascii="Arial" w:hAnsi="Arial" w:cs="Arial"/>
+          <w:color w:val="333333"/>
+          <w:lang w:eastAsia="zh-CN"/>
         </w:rPr>
         <w:br/>
       </w:r>
       <w:r>
         <w:rPr>
+          <w:rStyle w:val="md-plain"/>
           <w:rFonts w:ascii="Arial" w:hAnsi="Arial" w:cs="Arial"/>
           <w:b/>
           <w:bCs/>
-          <w:color w:val="000000" w:themeColor="text1"/>
+          <w:color w:val="333333"/>
         </w:rPr>
         <w:t>API Documentation (PDF):</w:t>
       </w:r>
       <w:r>
         <w:rPr>
-          <w:rFonts w:ascii="Arial" w:hAnsi="Arial" w:cs="Arial"/>
-          <w:color w:val="000000" w:themeColor="text1"/>
+          <w:rStyle w:val="md-plain"/>
+          <w:rFonts w:ascii="Arial" w:hAnsi="Arial" w:cs="Arial"/>
+          <w:color w:val="333333"/>
         </w:rPr>
         <w:t xml:space="preserve"> </w:t>
       </w:r>
-      <w:hyperlink r:id="rId6">
+      <w:hyperlink r:id="rId6" w:history="1">
         <w:r>
           <w:rPr>
-            <w:rStyle w:val="af"/>
+            <w:rStyle w:val="md-plain"/>
             <w:rFonts w:ascii="Arial" w:hAnsi="Arial" w:cs="Arial"/>
-            <w:color w:val="000000" w:themeColor="text1"/>
+            <w:color w:val="4183C4"/>
+            <w:u w:val="single"/>
           </w:rPr>
-          <w:t>docs/api_documentation.pdf</w:t>
+          <w:t>https://github.com/Yuk11119/Web_Services_cw1/blob/main/docs/api_documentation.pdf</w:t>
         </w:r>
       </w:hyperlink>
       <w:r>
         <w:rPr>
-          <w:rFonts w:ascii="Arial" w:hAnsi="Arial" w:cs="Arial"/>
-          <w:color w:val="000000" w:themeColor="text1"/>
+          <w:rStyle w:val="md-linebreak"/>
+          <w:rFonts w:ascii="Arial" w:hAnsi="Arial" w:cs="Arial"/>
+          <w:color w:val="333333"/>
+        </w:rPr>
+        <w:t xml:space="preserve"> </w:t>
+      </w:r>
+      <w:r>
+        <w:rPr>
+          <w:rStyle w:val="md-linebreak"/>
+          <w:rFonts w:ascii="Arial" w:hAnsi="Arial" w:cs="Arial"/>
+          <w:color w:val="333333"/>
+          <w:lang w:eastAsia="zh-CN"/>
         </w:rPr>
         <w:br/>
       </w:r>
       <w:r>
         <w:rPr>
+          <w:rStyle w:val="md-plain"/>
           <w:rFonts w:ascii="Arial" w:hAnsi="Arial" w:cs="Arial"/>
           <w:b/>
           <w:bCs/>
-          <w:color w:val="000000" w:themeColor="text1"/>
+          <w:color w:val="333333"/>
         </w:rPr>
         <w:t>Presentation / Visuals Link:</w:t>
       </w:r>
       <w:r>
         <w:rPr>
-          <w:rFonts w:ascii="Arial" w:hAnsi="Arial" w:cs="Arial"/>
-          <w:color w:val="000000" w:themeColor="text1"/>
+          <w:rStyle w:val="md-plain"/>
+          <w:rFonts w:ascii="Arial" w:hAnsi="Arial" w:cs="Arial"/>
+          <w:color w:val="333333"/>
         </w:rPr>
         <w:t xml:space="preserve"> </w:t>
       </w:r>
-      <w:hyperlink r:id="rId7">
+      <w:hyperlink r:id="rId7" w:history="1">
         <w:r>
           <w:rPr>
-            <w:rStyle w:val="af"/>
+            <w:rStyle w:val="md-plain"/>
             <w:rFonts w:ascii="Arial" w:hAnsi="Arial" w:cs="Arial"/>
-            <w:color w:val="000000" w:themeColor="text1"/>
+            <w:color w:val="4183C4"/>
+            <w:u w:val="single"/>
           </w:rPr>
-          <w:t>TBD_SLIDES_LINK</w:t>
+          <w:t>https://github.com/Yuk11119/Web_Services_cw1/blob/main/docs/presentation_slides.pptx</w:t>
         </w:r>
       </w:hyperlink>
-      <w:bookmarkStart w:id="1" w:name="X1c555f901308e0ca1fe83531c356e1a10b9c010"/>
     </w:p>
     <w:p>
       <w:pPr>
@@ -292,7 +321,7 @@
           <w:sz w:val="22"/>
           <w:szCs w:val="22"/>
         </w:rPr>
-        <w:t xml:space="preserve"> + SQLAlchemy + Alembic + JWT authentication + </w:t>
+        <w:t xml:space="preserve"> + </w:t>
       </w:r>
       <w:proofErr w:type="spellStart"/>
       <w:r>
@@ -302,6 +331,26 @@
           <w:sz w:val="22"/>
           <w:szCs w:val="22"/>
         </w:rPr>
+        <w:t>SQLAlchemy</w:t>
+      </w:r>
+      <w:proofErr w:type="spellEnd"/>
+      <w:r>
+        <w:rPr>
+          <w:rFonts w:ascii="Arial" w:hAnsi="Arial" w:cs="Arial"/>
+          <w:color w:val="000000" w:themeColor="text1"/>
+          <w:sz w:val="22"/>
+          <w:szCs w:val="22"/>
+        </w:rPr>
+        <w:t xml:space="preserve"> + Alembic + JWT authentication + </w:t>
+      </w:r>
+      <w:proofErr w:type="spellStart"/>
+      <w:r>
+        <w:rPr>
+          <w:rFonts w:ascii="Arial" w:hAnsi="Arial" w:cs="Arial"/>
+          <w:color w:val="000000" w:themeColor="text1"/>
+          <w:sz w:val="22"/>
+          <w:szCs w:val="22"/>
+        </w:rPr>
         <w:t>Pytest</w:t>
       </w:r>
       <w:proofErr w:type="spellEnd"/>
@@ -454,25 +503,14 @@
         </w:rPr>
         <w:t xml:space="preserve"> </w:t>
       </w:r>
-      <w:proofErr w:type="gramStart"/>
-      <w:r>
-        <w:rPr>
-          <w:rFonts w:ascii="Arial" w:hAnsi="Arial" w:cs="Arial"/>
-          <w:color w:val="000000" w:themeColor="text1"/>
-          <w:sz w:val="22"/>
-          <w:szCs w:val="22"/>
-        </w:rPr>
-        <w:t>This</w:t>
-      </w:r>
-      <w:proofErr w:type="gramEnd"/>
-      <w:r>
-        <w:rPr>
-          <w:rFonts w:ascii="Arial" w:hAnsi="Arial" w:cs="Arial"/>
-          <w:color w:val="000000" w:themeColor="text1"/>
-          <w:sz w:val="22"/>
-          <w:szCs w:val="22"/>
-        </w:rPr>
-        <w:t xml:space="preserve"> stack balances delivery speed and engineering rigor, while remaining easy to justify in oral Q&amp;A.</w:t>
+      <w:r>
+        <w:rPr>
+          <w:rFonts w:ascii="Arial" w:hAnsi="Arial" w:cs="Arial"/>
+          <w:color w:val="000000" w:themeColor="text1"/>
+          <w:sz w:val="22"/>
+          <w:szCs w:val="22"/>
+        </w:rPr>
+        <w:t>This stack balances delivery speed and engineering rigor, while remaining easy to justify in oral Q&amp;A.</w:t>
       </w:r>
     </w:p>
     <w:p>
@@ -650,6 +688,7 @@
           <w:sz w:val="22"/>
           <w:szCs w:val="22"/>
         </w:rPr>
+        <w:lastRenderedPageBreak/>
         <w:t>Model/schema layers (</w:t>
       </w:r>
       <w:r>
@@ -703,18 +742,7 @@
           <w:szCs w:val="22"/>
           <w:lang w:eastAsia="en-US"/>
         </w:rPr>
-        <w:t xml:space="preserve">The data model comprises users, authors, books, and reviews, structured with relational constraints to ensure integrity and efficiency. Specifically, the books table enforces a </w:t>
-      </w:r>
-      <w:r>
-        <w:rPr>
-          <w:rFonts w:ascii="Arial" w:eastAsiaTheme="minorEastAsia" w:hAnsi="Arial" w:cs="Arial"/>
-          <w:color w:val="000000" w:themeColor="text1"/>
-          <w:sz w:val="22"/>
-          <w:szCs w:val="22"/>
-          <w:lang w:eastAsia="en-US"/>
-        </w:rPr>
-        <w:lastRenderedPageBreak/>
-        <w:t>unique ISBN constraint, review ratings are restricted to the range of 1 to 5 through database-level checks, and foreign key relationships maintain referential consistency across entities. Additionally, indexes are applied to common filtering fields to improve query performance.</w:t>
+        <w:t>The data model comprises users, authors, books, and reviews, structured with relational constraints to ensure integrity and efficiency. Specifically, the books table enforces a unique ISBN constraint, review ratings are restricted to the range of 1 to 5 through database-level checks, and foreign key relationships maintain referential consistency across entities. Additionally, indexes are applied to common filtering fields to improve query performance.</w:t>
       </w:r>
     </w:p>
     <w:p>
@@ -953,6 +981,7 @@
           <w:rFonts w:ascii="Arial" w:hAnsi="Arial" w:cs="Arial"/>
           <w:color w:val="000000" w:themeColor="text1"/>
         </w:rPr>
+        <w:lastRenderedPageBreak/>
         <w:t>I</w:t>
       </w:r>
       <w:r>
@@ -1058,7 +1087,6 @@
           <w:sz w:val="22"/>
           <w:szCs w:val="22"/>
         </w:rPr>
-        <w:lastRenderedPageBreak/>
         <w:t>Books CRUD + filters (</w:t>
       </w:r>
       <w:r>
@@ -1497,6 +1525,7 @@
     <w:p>
       <w:pPr>
         <w:pStyle w:val="a0"/>
+        <w:jc w:val="center"/>
         <w:rPr>
           <w:rFonts w:ascii="Arial" w:hAnsi="Arial" w:cs="Arial"/>
           <w:color w:val="000000" w:themeColor="text1"/>
@@ -1509,8 +1538,8 @@
           <w:color w:val="000000" w:themeColor="text1"/>
         </w:rPr>
         <w:drawing>
-          <wp:inline distT="0" distB="0" distL="0" distR="0" wp14:anchorId="3BC47588" wp14:editId="7ADDAB62">
-            <wp:extent cx="5334000" cy="2667000"/>
+          <wp:inline distT="0" distB="0" distL="0" distR="0" wp14:anchorId="3BC47588" wp14:editId="7812B141">
+            <wp:extent cx="4643562" cy="2425148"/>
             <wp:effectExtent l="0" t="0" r="0" b="0"/>
             <wp:docPr id="34" name="Picture" title="fig:"/>
             <wp:cNvGraphicFramePr/>
@@ -1532,7 +1561,7 @@
                   <pic:spPr bwMode="auto">
                     <a:xfrm>
                       <a:off x="0" y="0"/>
-                      <a:ext cx="5334000" cy="2667000"/>
+                      <a:ext cx="4671601" cy="2439791"/>
                     </a:xfrm>
                     <a:prstGeom prst="rect">
                       <a:avLst/>
@@ -1654,6 +1683,7 @@
           <w:sz w:val="28"/>
           <w:szCs w:val="28"/>
         </w:rPr>
+        <w:lastRenderedPageBreak/>
         <w:t>5. Testing Strategy and Evidence</w:t>
       </w:r>
     </w:p>
@@ -1674,17 +1704,7 @@
           <w:sz w:val="22"/>
           <w:szCs w:val="22"/>
         </w:rPr>
-        <w:t xml:space="preserve">Testing focuses on integration-level behaviors in line with coursework marking priorities, including authentication success and failure cases, access control for protected routes, </w:t>
-      </w:r>
-      <w:r>
-        <w:rPr>
-          <w:rFonts w:ascii="Arial" w:hAnsi="Arial" w:cs="Arial"/>
-          <w:color w:val="000000" w:themeColor="text1"/>
-          <w:sz w:val="22"/>
-          <w:szCs w:val="22"/>
-        </w:rPr>
-        <w:lastRenderedPageBreak/>
-        <w:t>end-to-end CRUD workflows, handling of duplicate ISBN conflicts, validation failure scenarios, and the correctness of analytics endpoint responses.</w:t>
+        <w:t>Testing focuses on integration-level behaviors in line with coursework marking priorities, including authentication success and failure cases, access control for protected routes, end-to-end CRUD workflows, handling of duplicate ISBN conflicts, validation failure scenarios, and the correctness of analytics endpoint responses.</w:t>
       </w:r>
     </w:p>
     <w:p>
@@ -1709,6 +1729,7 @@
     <w:p>
       <w:pPr>
         <w:pStyle w:val="a0"/>
+        <w:jc w:val="center"/>
         <w:rPr>
           <w:rFonts w:ascii="Arial" w:hAnsi="Arial" w:cs="Arial"/>
           <w:color w:val="000000" w:themeColor="text1"/>
@@ -1721,8 +1742,8 @@
           <w:color w:val="000000" w:themeColor="text1"/>
         </w:rPr>
         <w:drawing>
-          <wp:inline distT="0" distB="0" distL="0" distR="0" wp14:anchorId="2504CBA9" wp14:editId="4405CC04">
-            <wp:extent cx="5334000" cy="2844800"/>
+          <wp:inline distT="0" distB="0" distL="0" distR="0" wp14:anchorId="2504CBA9" wp14:editId="71C2CDA7">
+            <wp:extent cx="4094922" cy="2242268"/>
             <wp:effectExtent l="0" t="0" r="0" b="0"/>
             <wp:docPr id="40" name="Picture" title="fig:"/>
             <wp:cNvGraphicFramePr/>
@@ -1744,7 +1765,7 @@
                   <pic:spPr bwMode="auto">
                     <a:xfrm>
                       <a:off x="0" y="0"/>
-                      <a:ext cx="5334000" cy="2844800"/>
+                      <a:ext cx="4136029" cy="2264777"/>
                     </a:xfrm>
                     <a:prstGeom prst="rect">
                       <a:avLst/>
@@ -4320,6 +4341,33 @@
       <w:lang w:eastAsia="zh-CN"/>
     </w:rPr>
   </w:style>
+  <w:style w:type="character" w:styleId="af0">
+    <w:name w:val="Unresolved Mention"/>
+    <w:basedOn w:val="a1"/>
+    <w:uiPriority w:val="99"/>
+    <w:semiHidden/>
+    <w:unhideWhenUsed/>
+    <w:rsid w:val="009A2E9D"/>
+    <w:rPr>
+      <w:color w:val="605E5C"/>
+      <w:shd w:val="clear" w:color="auto" w:fill="E1DFDD"/>
+    </w:rPr>
+  </w:style>
+  <w:style w:type="character" w:customStyle="1" w:styleId="md-plain">
+    <w:name w:val="md-plain"/>
+    <w:basedOn w:val="a1"/>
+    <w:rsid w:val="00D43D15"/>
+  </w:style>
+  <w:style w:type="character" w:customStyle="1" w:styleId="md-meta-i-c">
+    <w:name w:val="md-meta-i-c"/>
+    <w:basedOn w:val="a1"/>
+    <w:rsid w:val="00D43D15"/>
+  </w:style>
+  <w:style w:type="character" w:customStyle="1" w:styleId="md-linebreak">
+    <w:name w:val="md-linebreak"/>
+    <w:basedOn w:val="a1"/>
+    <w:rsid w:val="00D43D15"/>
+  </w:style>
 </w:styles>
 </file>
 

</xml_diff>